<commit_message>
update : minor resume update.
</commit_message>
<xml_diff>
--- a/assets/Mahesh Morde_Software Engineer_9766228503_30.docx
+++ b/assets/Mahesh Morde_Software Engineer_9766228503_30.docx
@@ -1,6 +1,6 @@
 
 <file path=word/document.xml><?xml version="1.0" encoding="utf-8"?>
-<w:document xmlns:wpc="http://schemas.microsoft.com/office/word/2010/wordprocessingCanvas" xmlns:cx="http://schemas.microsoft.com/office/drawing/2014/chartex" xmlns:cx1="http://schemas.microsoft.com/office/drawing/2015/9/8/chartex" xmlns:cx2="http://schemas.microsoft.com/office/drawing/2015/10/21/chartex" xmlns:cx3="http://schemas.microsoft.com/office/drawing/2016/5/9/chartex" xmlns:cx4="http://schemas.microsoft.com/office/drawing/2016/5/10/chartex" xmlns:cx5="http://schemas.microsoft.com/office/drawing/2016/5/11/chartex" xmlns:cx6="http://schemas.microsoft.com/office/drawing/2016/5/12/chartex" xmlns:cx7="http://schemas.microsoft.com/office/drawing/2016/5/13/chartex" xmlns:cx8="http://schemas.microsoft.com/office/drawing/2016/5/14/chartex" xmlns:mc="http://schemas.openxmlformats.org/markup-compatibility/2006" xmlns:aink="http://schemas.microsoft.com/office/drawing/2016/ink" xmlns:am3d="http://schemas.microsoft.com/office/drawing/2017/model3d" xmlns:o="urn:schemas-microsoft-com:office:office" xmlns:oel="http://schemas.microsoft.com/office/2019/extlst" xmlns:r="http://schemas.openxmlformats.org/officeDocument/2006/relationships" xmlns:m="http://schemas.openxmlformats.org/officeDocument/2006/math" xmlns:v="urn:schemas-microsoft-com:vml" xmlns:wp14="http://schemas.microsoft.com/office/word/2010/wordprocessingDrawing" xmlns:wp="http://schemas.openxmlformats.org/drawingml/2006/wordprocessingDrawing" xmlns:w10="urn:schemas-microsoft-com:office:word" xmlns:w="http://schemas.openxmlformats.org/wordprocessingml/2006/main" xmlns:w14="http://schemas.microsoft.com/office/word/2010/wordml" xmlns:w15="http://schemas.microsoft.com/office/word/2012/wordml" xmlns:w16cex="http://schemas.microsoft.com/office/word/2018/wordml/cex" xmlns:w16cid="http://schemas.microsoft.com/office/word/2016/wordml/cid" xmlns:w16="http://schemas.microsoft.com/office/word/2018/wordml" xmlns:w16du="http://schemas.microsoft.com/office/word/2023/wordml/word16du" xmlns:w16sdtdh="http://schemas.microsoft.com/office/word/2020/wordml/sdtdatahash" xmlns:w16sdtfl="http://schemas.microsoft.com/office/word/2024/wordml/sdtformatlock" xmlns:w16se="http://schemas.microsoft.com/office/word/2015/wordml/symex" xmlns:wpg="http://schemas.microsoft.com/office/word/2010/wordprocessingGroup" xmlns:wpi="http://schemas.microsoft.com/office/word/2010/wordprocessingInk" xmlns:wne="http://schemas.microsoft.com/office/word/2006/wordml" xmlns:wps="http://schemas.microsoft.com/office/word/2010/wordprocessingShape" mc:Ignorable="w14 w15 w16se w16cid w16 w16cex w16sdtdh w16sdtfl w16du wp14">
+<w:document xmlns:wpc="http://schemas.microsoft.com/office/word/2010/wordprocessingCanvas" xmlns:cx="http://schemas.microsoft.com/office/drawing/2014/chartex" xmlns:cx1="http://schemas.microsoft.com/office/drawing/2015/9/8/chartex" xmlns:cx2="http://schemas.microsoft.com/office/drawing/2015/10/21/chartex" xmlns:cx3="http://schemas.microsoft.com/office/drawing/2016/5/9/chartex" xmlns:cx4="http://schemas.microsoft.com/office/drawing/2016/5/10/chartex" xmlns:cx5="http://schemas.microsoft.com/office/drawing/2016/5/11/chartex" xmlns:cx6="http://schemas.microsoft.com/office/drawing/2016/5/12/chartex" xmlns:cx7="http://schemas.microsoft.com/office/drawing/2016/5/13/chartex" xmlns:cx8="http://schemas.microsoft.com/office/drawing/2016/5/14/chartex" xmlns:mc="http://schemas.openxmlformats.org/markup-compatibility/2006" xmlns:aink="http://schemas.microsoft.com/office/drawing/2016/ink" xmlns:am3d="http://schemas.microsoft.com/office/drawing/2017/model3d" xmlns:o="urn:schemas-microsoft-com:office:office" xmlns:oel="http://schemas.microsoft.com/office/2019/extlst" xmlns:r="http://schemas.openxmlformats.org/officeDocument/2006/relationships" xmlns:m="http://schemas.openxmlformats.org/officeDocument/2006/math" xmlns:v="urn:schemas-microsoft-com:vml" xmlns:wp14="http://schemas.microsoft.com/office/word/2010/wordprocessingDrawing" xmlns:wp="http://schemas.openxmlformats.org/drawingml/2006/wordprocessingDrawing" xmlns:w10="urn:schemas-microsoft-com:office:word" xmlns:w="http://schemas.openxmlformats.org/wordprocessingml/2006/main" xmlns:w14="http://schemas.microsoft.com/office/word/2010/wordml" xmlns:w15="http://schemas.microsoft.com/office/word/2012/wordml" xmlns:w16cex="http://schemas.microsoft.com/office/word/2018/wordml/cex" xmlns:w16cid="http://schemas.microsoft.com/office/word/2016/wordml/cid" xmlns:w16="http://schemas.microsoft.com/office/word/2018/wordml" xmlns:w16sdtdh="http://schemas.microsoft.com/office/word/2020/wordml/sdtdatahash" xmlns:w16se="http://schemas.microsoft.com/office/word/2015/wordml/symex" xmlns:wpg="http://schemas.microsoft.com/office/word/2010/wordprocessingGroup" xmlns:wpi="http://schemas.microsoft.com/office/word/2010/wordprocessingInk" xmlns:wne="http://schemas.microsoft.com/office/word/2006/wordml" xmlns:wps="http://schemas.microsoft.com/office/word/2010/wordprocessingShape" mc:Ignorable="w14 w15 w16se w16cid w16 w16cex w16sdtdh wp14">
   <w:body>
     <w:p>
       <w:pPr>
@@ -192,11 +192,6 @@
       <w:r>
         <w:t xml:space="preserve"> to accelerate development, automate repetitive coding tasks, debug issues, and improve overall code quality and productivity. Comfortable working in Agile environments and collaborating with cross-functional teams to deliver high-quality software solutions.</w:t>
       </w:r>
-    </w:p>
-    <w:p>
-      <w:pPr>
-        <w:spacing w:after="80" w:line="240" w:lineRule="auto"/>
-      </w:pPr>
     </w:p>
     <w:p>
       <w:pPr>
@@ -575,11 +570,6 @@
     <w:p>
       <w:pPr>
         <w:spacing w:after="80" w:line="240" w:lineRule="auto"/>
-      </w:pPr>
-    </w:p>
-    <w:p>
-      <w:pPr>
-        <w:spacing w:after="80" w:line="240" w:lineRule="auto"/>
         <w:rPr>
           <w:rStyle w:val="IntenseEmphasis"/>
           <w:sz w:val="28"/>
@@ -748,7 +738,10 @@
         <w:shd w:val="clear" w:color="auto" w:fill="FFFFFF"/>
         <w:spacing w:before="0" w:after="0" w:line="300" w:lineRule="atLeast"/>
         <w:rPr>
-          <w:b w:val="0"/>
+          <w:rStyle w:val="IntenseEmphasis"/>
+          <w:bCs w:val="0"/>
+          <w:i w:val="0"/>
+          <w:iCs w:val="0"/>
           <w:color w:val="000000"/>
           <w:sz w:val="22"/>
           <w:szCs w:val="22"/>
@@ -776,7 +769,27 @@
           <w:sz w:val="22"/>
           <w:szCs w:val="22"/>
         </w:rPr>
-        <w:t>– Certificate from IT Vedant Institute</w:t>
+        <w:t xml:space="preserve">– Certificate from IT </w:t>
+      </w:r>
+      <w:proofErr w:type="spellStart"/>
+      <w:r>
+        <w:rPr>
+          <w:b w:val="0"/>
+          <w:color w:val="000000"/>
+          <w:sz w:val="22"/>
+          <w:szCs w:val="22"/>
+        </w:rPr>
+        <w:t>Vedant</w:t>
+      </w:r>
+      <w:proofErr w:type="spellEnd"/>
+      <w:r>
+        <w:rPr>
+          <w:b w:val="0"/>
+          <w:color w:val="000000"/>
+          <w:sz w:val="22"/>
+          <w:szCs w:val="22"/>
+        </w:rPr>
+        <w:t xml:space="preserve"> Institute</w:t>
       </w:r>
     </w:p>
     <w:p>
@@ -798,22 +811,12 @@
           <w:szCs w:val="28"/>
         </w:rPr>
       </w:pPr>
-    </w:p>
-    <w:p>
-      <w:pPr>
-        <w:spacing w:after="80" w:line="240" w:lineRule="auto"/>
+      <w:r>
         <w:rPr>
           <w:rStyle w:val="IntenseEmphasis"/>
           <w:sz w:val="28"/>
           <w:szCs w:val="28"/>
         </w:rPr>
-      </w:pPr>
-      <w:r>
-        <w:rPr>
-          <w:rStyle w:val="IntenseEmphasis"/>
-          <w:sz w:val="28"/>
-          <w:szCs w:val="28"/>
-        </w:rPr>
         <w:t>WORK EXPERIENCE</w:t>
       </w:r>
     </w:p>
@@ -899,7 +902,45 @@
         <w:rPr>
           <w:color w:val="808080" w:themeColor="background1" w:themeShade="80"/>
         </w:rPr>
-        <w:t>Present</w:t>
+        <w:t xml:space="preserve">7/2026 </w:t>
+      </w:r>
+      <w:r>
+        <w:rPr>
+          <w:color w:val="808080" w:themeColor="background1" w:themeShade="80"/>
+        </w:rPr>
+        <w:t>(</w:t>
+      </w:r>
+      <w:r>
+        <w:rPr>
+          <w:color w:val="808080" w:themeColor="background1" w:themeShade="80"/>
+        </w:rPr>
+        <w:t xml:space="preserve">2 </w:t>
+      </w:r>
+      <w:proofErr w:type="spellStart"/>
+      <w:r>
+        <w:rPr>
+          <w:color w:val="808080" w:themeColor="background1" w:themeShade="80"/>
+        </w:rPr>
+        <w:t>yrs</w:t>
+      </w:r>
+      <w:proofErr w:type="spellEnd"/>
+      <w:r>
+        <w:rPr>
+          <w:color w:val="808080" w:themeColor="background1" w:themeShade="80"/>
+        </w:rPr>
+        <w:t xml:space="preserve"> </w:t>
+      </w:r>
+      <w:r>
+        <w:rPr>
+          <w:color w:val="808080" w:themeColor="background1" w:themeShade="80"/>
+        </w:rPr>
+        <w:t>3</w:t>
+      </w:r>
+      <w:r>
+        <w:rPr>
+          <w:color w:val="808080" w:themeColor="background1" w:themeShade="80"/>
+        </w:rPr>
+        <w:t xml:space="preserve"> months)</w:t>
       </w:r>
     </w:p>
     <w:p>
@@ -1113,7 +1154,6 @@
           <w:szCs w:val="20"/>
           <w:lang w:val="en-US"/>
         </w:rPr>
-        <w:lastRenderedPageBreak/>
         <w:t>Designed and implemented multi-tenant architecture with role-based access control (RBAC) to support diverse client requirements</w:t>
       </w:r>
       <w:r>
@@ -1190,6 +1230,7 @@
           <w:szCs w:val="20"/>
           <w:lang w:val="en-US"/>
         </w:rPr>
+        <w:lastRenderedPageBreak/>
         <w:t>Integrated RESTful APIs for real-time data synchronization and seamless backend communication</w:t>
       </w:r>
       <w:r>
@@ -1699,14 +1740,12 @@
         </w:rPr>
         <w:t xml:space="preserve">2. </w:t>
       </w:r>
-      <w:proofErr w:type="spellStart"/>
       <w:r>
         <w:rPr>
           <w:b/>
         </w:rPr>
-        <w:t>Catalog</w:t>
-      </w:r>
-      <w:proofErr w:type="spellEnd"/>
+        <w:t>Associate</w:t>
+      </w:r>
       <w:r>
         <w:rPr>
           <w:b/>
@@ -1717,13 +1756,7 @@
         <w:rPr>
           <w:b/>
         </w:rPr>
-        <w:t>Associate</w:t>
-      </w:r>
-      <w:r>
-        <w:rPr>
-          <w:b/>
-        </w:rPr>
-        <w:t xml:space="preserve"> </w:t>
+        <w:t>Engineer (RBS | CMT)</w:t>
       </w:r>
     </w:p>
     <w:p>
@@ -2418,6 +2451,21 @@
     <w:p>
       <w:pPr>
         <w:spacing w:after="80" w:line="240" w:lineRule="auto"/>
+      </w:pPr>
+    </w:p>
+    <w:p>
+      <w:pPr>
+        <w:spacing w:after="80" w:line="240" w:lineRule="auto"/>
+      </w:pPr>
+    </w:p>
+    <w:p>
+      <w:pPr>
+        <w:spacing w:after="80" w:line="240" w:lineRule="auto"/>
+      </w:pPr>
+    </w:p>
+    <w:p>
+      <w:pPr>
+        <w:spacing w:after="80" w:line="240" w:lineRule="auto"/>
         <w:rPr>
           <w:rStyle w:val="IntenseEmphasis"/>
           <w:sz w:val="28"/>
@@ -2718,7 +2766,15 @@
           <w:sz w:val="20"/>
           <w:szCs w:val="20"/>
         </w:rPr>
-        <w:t>2017 – 2022</w:t>
+        <w:t>2017 – 202</w:t>
+      </w:r>
+      <w:r>
+        <w:rPr>
+          <w:color w:val="808080" w:themeColor="background1" w:themeShade="80"/>
+          <w:sz w:val="20"/>
+          <w:szCs w:val="20"/>
+        </w:rPr>
+        <w:t>1</w:t>
       </w:r>
     </w:p>
     <w:p>
@@ -2770,7 +2826,7 @@
 </file>
 
 <file path=word/numbering.xml><?xml version="1.0" encoding="utf-8"?>
-<w:numbering xmlns:wpc="http://schemas.microsoft.com/office/word/2010/wordprocessingCanvas" xmlns:cx="http://schemas.microsoft.com/office/drawing/2014/chartex" xmlns:cx1="http://schemas.microsoft.com/office/drawing/2015/9/8/chartex" xmlns:cx2="http://schemas.microsoft.com/office/drawing/2015/10/21/chartex" xmlns:cx3="http://schemas.microsoft.com/office/drawing/2016/5/9/chartex" xmlns:cx4="http://schemas.microsoft.com/office/drawing/2016/5/10/chartex" xmlns:cx5="http://schemas.microsoft.com/office/drawing/2016/5/11/chartex" xmlns:cx6="http://schemas.microsoft.com/office/drawing/2016/5/12/chartex" xmlns:cx7="http://schemas.microsoft.com/office/drawing/2016/5/13/chartex" xmlns:cx8="http://schemas.microsoft.com/office/drawing/2016/5/14/chartex" xmlns:mc="http://schemas.openxmlformats.org/markup-compatibility/2006" xmlns:aink="http://schemas.microsoft.com/office/drawing/2016/ink" xmlns:am3d="http://schemas.microsoft.com/office/drawing/2017/model3d" xmlns:o="urn:schemas-microsoft-com:office:office" xmlns:oel="http://schemas.microsoft.com/office/2019/extlst" xmlns:r="http://schemas.openxmlformats.org/officeDocument/2006/relationships" xmlns:m="http://schemas.openxmlformats.org/officeDocument/2006/math" xmlns:v="urn:schemas-microsoft-com:vml" xmlns:wp14="http://schemas.microsoft.com/office/word/2010/wordprocessingDrawing" xmlns:wp="http://schemas.openxmlformats.org/drawingml/2006/wordprocessingDrawing" xmlns:w10="urn:schemas-microsoft-com:office:word" xmlns:w="http://schemas.openxmlformats.org/wordprocessingml/2006/main" xmlns:w14="http://schemas.microsoft.com/office/word/2010/wordml" xmlns:w15="http://schemas.microsoft.com/office/word/2012/wordml" xmlns:w16cex="http://schemas.microsoft.com/office/word/2018/wordml/cex" xmlns:w16cid="http://schemas.microsoft.com/office/word/2016/wordml/cid" xmlns:w16="http://schemas.microsoft.com/office/word/2018/wordml" xmlns:w16du="http://schemas.microsoft.com/office/word/2023/wordml/word16du" xmlns:w16sdtdh="http://schemas.microsoft.com/office/word/2020/wordml/sdtdatahash" xmlns:w16sdtfl="http://schemas.microsoft.com/office/word/2024/wordml/sdtformatlock" xmlns:w16se="http://schemas.microsoft.com/office/word/2015/wordml/symex" xmlns:wpg="http://schemas.microsoft.com/office/word/2010/wordprocessingGroup" xmlns:wpi="http://schemas.microsoft.com/office/word/2010/wordprocessingInk" xmlns:wne="http://schemas.microsoft.com/office/word/2006/wordml" xmlns:wps="http://schemas.microsoft.com/office/word/2010/wordprocessingShape" mc:Ignorable="w14 w15 w16se w16cid w16 w16cex w16sdtdh w16sdtfl w16du wp14">
+<w:numbering xmlns:wpc="http://schemas.microsoft.com/office/word/2010/wordprocessingCanvas" xmlns:cx="http://schemas.microsoft.com/office/drawing/2014/chartex" xmlns:cx1="http://schemas.microsoft.com/office/drawing/2015/9/8/chartex" xmlns:cx2="http://schemas.microsoft.com/office/drawing/2015/10/21/chartex" xmlns:cx3="http://schemas.microsoft.com/office/drawing/2016/5/9/chartex" xmlns:cx4="http://schemas.microsoft.com/office/drawing/2016/5/10/chartex" xmlns:cx5="http://schemas.microsoft.com/office/drawing/2016/5/11/chartex" xmlns:cx6="http://schemas.microsoft.com/office/drawing/2016/5/12/chartex" xmlns:cx7="http://schemas.microsoft.com/office/drawing/2016/5/13/chartex" xmlns:cx8="http://schemas.microsoft.com/office/drawing/2016/5/14/chartex" xmlns:mc="http://schemas.openxmlformats.org/markup-compatibility/2006" xmlns:aink="http://schemas.microsoft.com/office/drawing/2016/ink" xmlns:am3d="http://schemas.microsoft.com/office/drawing/2017/model3d" xmlns:o="urn:schemas-microsoft-com:office:office" xmlns:oel="http://schemas.microsoft.com/office/2019/extlst" xmlns:r="http://schemas.openxmlformats.org/officeDocument/2006/relationships" xmlns:m="http://schemas.openxmlformats.org/officeDocument/2006/math" xmlns:v="urn:schemas-microsoft-com:vml" xmlns:wp14="http://schemas.microsoft.com/office/word/2010/wordprocessingDrawing" xmlns:wp="http://schemas.openxmlformats.org/drawingml/2006/wordprocessingDrawing" xmlns:w10="urn:schemas-microsoft-com:office:word" xmlns:w="http://schemas.openxmlformats.org/wordprocessingml/2006/main" xmlns:w14="http://schemas.microsoft.com/office/word/2010/wordml" xmlns:w15="http://schemas.microsoft.com/office/word/2012/wordml" xmlns:w16cex="http://schemas.microsoft.com/office/word/2018/wordml/cex" xmlns:w16cid="http://schemas.microsoft.com/office/word/2016/wordml/cid" xmlns:w16="http://schemas.microsoft.com/office/word/2018/wordml" xmlns:w16sdtdh="http://schemas.microsoft.com/office/word/2020/wordml/sdtdatahash" xmlns:w16se="http://schemas.microsoft.com/office/word/2015/wordml/symex" xmlns:wpg="http://schemas.microsoft.com/office/word/2010/wordprocessingGroup" xmlns:wpi="http://schemas.microsoft.com/office/word/2010/wordprocessingInk" xmlns:wne="http://schemas.microsoft.com/office/word/2006/wordml" xmlns:wps="http://schemas.microsoft.com/office/word/2010/wordprocessingShape" mc:Ignorable="w14 w15 w16se w16cid w16 w16cex w16sdtdh wp14">
   <w:abstractNum w:abstractNumId="0" w15:restartNumberingAfterBreak="0">
     <w:nsid w:val="0A580E47"/>
     <w:multiLevelType w:val="multilevel"/>
@@ -6913,7 +6969,7 @@
 </file>
 
 <file path=word/styles.xml><?xml version="1.0" encoding="utf-8"?>
-<w:styles xmlns:mc="http://schemas.openxmlformats.org/markup-compatibility/2006" xmlns:r="http://schemas.openxmlformats.org/officeDocument/2006/relationships" xmlns:w="http://schemas.openxmlformats.org/wordprocessingml/2006/main" xmlns:w14="http://schemas.microsoft.com/office/word/2010/wordml" xmlns:w15="http://schemas.microsoft.com/office/word/2012/wordml" xmlns:w16cex="http://schemas.microsoft.com/office/word/2018/wordml/cex" xmlns:w16cid="http://schemas.microsoft.com/office/word/2016/wordml/cid" xmlns:w16="http://schemas.microsoft.com/office/word/2018/wordml" xmlns:w16du="http://schemas.microsoft.com/office/word/2023/wordml/word16du" xmlns:w16sdtdh="http://schemas.microsoft.com/office/word/2020/wordml/sdtdatahash" xmlns:w16sdtfl="http://schemas.microsoft.com/office/word/2024/wordml/sdtformatlock" xmlns:w16se="http://schemas.microsoft.com/office/word/2015/wordml/symex" mc:Ignorable="w14 w15 w16se w16cid w16 w16cex w16sdtdh w16sdtfl w16du">
+<w:styles xmlns:mc="http://schemas.openxmlformats.org/markup-compatibility/2006" xmlns:r="http://schemas.openxmlformats.org/officeDocument/2006/relationships" xmlns:w="http://schemas.openxmlformats.org/wordprocessingml/2006/main" xmlns:w14="http://schemas.microsoft.com/office/word/2010/wordml" xmlns:w15="http://schemas.microsoft.com/office/word/2012/wordml" xmlns:w16cex="http://schemas.microsoft.com/office/word/2018/wordml/cex" xmlns:w16cid="http://schemas.microsoft.com/office/word/2016/wordml/cid" xmlns:w16="http://schemas.microsoft.com/office/word/2018/wordml" xmlns:w16sdtdh="http://schemas.microsoft.com/office/word/2020/wordml/sdtdatahash" xmlns:w16se="http://schemas.microsoft.com/office/word/2015/wordml/symex" mc:Ignorable="w14 w15 w16se w16cid w16 w16cex w16sdtdh">
   <w:docDefaults>
     <w:rPrDefault>
       <w:rPr>
@@ -7409,6 +7465,7 @@
   <w:style w:type="character" w:default="1" w:styleId="DefaultParagraphFont">
     <w:name w:val="Default Paragraph Font"/>
     <w:uiPriority w:val="1"/>
+    <w:semiHidden/>
     <w:unhideWhenUsed/>
   </w:style>
   <w:style w:type="table" w:default="1" w:styleId="TableNormal">
@@ -7893,28 +7950,28 @@
 </file>
 
 <file path=customXml/item1.xml><?xml version="1.0" encoding="utf-8"?>
+<b:Sources xmlns:b="http://schemas.openxmlformats.org/officeDocument/2006/bibliography" xmlns="http://schemas.openxmlformats.org/officeDocument/2006/bibliography" SelectedStyle="\APA.XSL" StyleName="APA"/>
+</file>
+
+<file path=customXml/item2.xml><?xml version="1.0" encoding="utf-8"?>
 <go:gDocsCustomXmlDataStorage xmlns:go="http://customooxmlschemas.google.com/" xmlns:r="http://schemas.openxmlformats.org/officeDocument/2006/relationships" uri="GoogleDocsCustomDataVersion2">
   <go:docsCustomData xmlns:go="http://customooxmlschemas.google.com/" roundtripDataSignature="AMtx7miEk1H21JdIr+TOyvqwi2eW5alUKQ==">CgMxLjAyCGguZ2pkZ3hzOAByITE3THlTaDhNVjRLalVlWXlDajNGS3JlSGtMYWNhX3pNQQ==</go:docsCustomData>
 </go:gDocsCustomXmlDataStorage>
 </file>
 
-<file path=customXml/item2.xml><?xml version="1.0" encoding="utf-8"?>
-<b:Sources xmlns:b="http://schemas.openxmlformats.org/officeDocument/2006/bibliography" xmlns="http://schemas.openxmlformats.org/officeDocument/2006/bibliography" SelectedStyle="\APA.XSL" StyleName="APA"/>
+<file path=customXml/itemProps1.xml><?xml version="1.0" encoding="utf-8"?>
+<ds:datastoreItem xmlns:ds="http://schemas.openxmlformats.org/officeDocument/2006/customXml" ds:itemID="{19DB2FBD-D5D2-4A8E-B370-7C96318831C9}">
+  <ds:schemaRefs>
+    <ds:schemaRef ds:uri="http://schemas.openxmlformats.org/officeDocument/2006/bibliography"/>
+  </ds:schemaRefs>
+</ds:datastoreItem>
 </file>
 
-<file path=customXml/itemProps1.xml><?xml version="1.0" encoding="utf-8"?>
+<file path=customXml/itemProps2.xml><?xml version="1.0" encoding="utf-8"?>
 <ds:datastoreItem xmlns:ds="http://schemas.openxmlformats.org/officeDocument/2006/customXml" ds:itemID="{11111111-1234-1234-1234-123412341234}">
   <ds:schemaRefs>
     <ds:schemaRef ds:uri="http://customooxmlschemas.google.com/"/>
     <ds:schemaRef ds:uri="http://schemas.openxmlformats.org/officeDocument/2006/relationships"/>
   </ds:schemaRefs>
 </ds:datastoreItem>
-</file>
-
-<file path=customXml/itemProps2.xml><?xml version="1.0" encoding="utf-8"?>
-<ds:datastoreItem xmlns:ds="http://schemas.openxmlformats.org/officeDocument/2006/customXml" ds:itemID="{19DB2FBD-D5D2-4A8E-B370-7C96318831C9}">
-  <ds:schemaRefs>
-    <ds:schemaRef ds:uri="http://schemas.openxmlformats.org/officeDocument/2006/bibliography"/>
-  </ds:schemaRefs>
-</ds:datastoreItem>
 </file>
</xml_diff>

<commit_message>
fix : minor fixes
</commit_message>
<xml_diff>
--- a/assets/Mahesh Morde_Software Engineer_9766228503_30.docx
+++ b/assets/Mahesh Morde_Software Engineer_9766228503_30.docx
@@ -1752,11 +1752,31 @@
         </w:rPr>
         <w:t xml:space="preserve"> </w:t>
       </w:r>
+      <w:proofErr w:type="spellStart"/>
       <w:r>
         <w:rPr>
           <w:b/>
         </w:rPr>
-        <w:t>Engineer (RBS | CMT)</w:t>
+        <w:t>Catalog</w:t>
+      </w:r>
+      <w:proofErr w:type="spellEnd"/>
+      <w:r>
+        <w:rPr>
+          <w:b/>
+        </w:rPr>
+        <w:t xml:space="preserve"> EN </w:t>
+      </w:r>
+      <w:r>
+        <w:rPr>
+          <w:b/>
+        </w:rPr>
+        <w:t xml:space="preserve"> </w:t>
+      </w:r>
+      <w:r>
+        <w:rPr>
+          <w:b/>
+        </w:rPr>
+        <w:t>(RBS | CMT)</w:t>
       </w:r>
     </w:p>
     <w:p>
@@ -7950,28 +7970,28 @@
 </file>
 
 <file path=customXml/item1.xml><?xml version="1.0" encoding="utf-8"?>
-<b:Sources xmlns:b="http://schemas.openxmlformats.org/officeDocument/2006/bibliography" xmlns="http://schemas.openxmlformats.org/officeDocument/2006/bibliography" SelectedStyle="\APA.XSL" StyleName="APA"/>
-</file>
-
-<file path=customXml/item2.xml><?xml version="1.0" encoding="utf-8"?>
 <go:gDocsCustomXmlDataStorage xmlns:go="http://customooxmlschemas.google.com/" xmlns:r="http://schemas.openxmlformats.org/officeDocument/2006/relationships" uri="GoogleDocsCustomDataVersion2">
   <go:docsCustomData xmlns:go="http://customooxmlschemas.google.com/" roundtripDataSignature="AMtx7miEk1H21JdIr+TOyvqwi2eW5alUKQ==">CgMxLjAyCGguZ2pkZ3hzOAByITE3THlTaDhNVjRLalVlWXlDajNGS3JlSGtMYWNhX3pNQQ==</go:docsCustomData>
 </go:gDocsCustomXmlDataStorage>
 </file>
 
-<file path=customXml/itemProps1.xml><?xml version="1.0" encoding="utf-8"?>
-<ds:datastoreItem xmlns:ds="http://schemas.openxmlformats.org/officeDocument/2006/customXml" ds:itemID="{19DB2FBD-D5D2-4A8E-B370-7C96318831C9}">
-  <ds:schemaRefs>
-    <ds:schemaRef ds:uri="http://schemas.openxmlformats.org/officeDocument/2006/bibliography"/>
-  </ds:schemaRefs>
-</ds:datastoreItem>
+<file path=customXml/item2.xml><?xml version="1.0" encoding="utf-8"?>
+<b:Sources xmlns:b="http://schemas.openxmlformats.org/officeDocument/2006/bibliography" xmlns="http://schemas.openxmlformats.org/officeDocument/2006/bibliography" SelectedStyle="\APA.XSL" StyleName="APA"/>
 </file>
 
-<file path=customXml/itemProps2.xml><?xml version="1.0" encoding="utf-8"?>
+<file path=customXml/itemProps1.xml><?xml version="1.0" encoding="utf-8"?>
 <ds:datastoreItem xmlns:ds="http://schemas.openxmlformats.org/officeDocument/2006/customXml" ds:itemID="{11111111-1234-1234-1234-123412341234}">
   <ds:schemaRefs>
     <ds:schemaRef ds:uri="http://customooxmlschemas.google.com/"/>
     <ds:schemaRef ds:uri="http://schemas.openxmlformats.org/officeDocument/2006/relationships"/>
   </ds:schemaRefs>
 </ds:datastoreItem>
+</file>
+
+<file path=customXml/itemProps2.xml><?xml version="1.0" encoding="utf-8"?>
+<ds:datastoreItem xmlns:ds="http://schemas.openxmlformats.org/officeDocument/2006/customXml" ds:itemID="{19DB2FBD-D5D2-4A8E-B370-7C96318831C9}">
+  <ds:schemaRefs>
+    <ds:schemaRef ds:uri="http://schemas.openxmlformats.org/officeDocument/2006/bibliography"/>
+  </ds:schemaRefs>
+</ds:datastoreItem>
 </file>
</xml_diff>